<commit_message>
Whitespace pass (content): grow plates, re-sequence, gallery to plate, lore
Residual no-art fixes on top of the engine pass (16 offenders now, from
39; no blanks):
- Session 5: grew the Seven-Eyes dice plate to full width.
- Session 6: moved the graveyard-rite plate above the DM-check note so it
  fills the page instead of pushing to a near-empty one.
- Compendium Part III: replaced the small closing 2-up gallery with a
  full-width Elaria plate; floated the seven-point-star image into its body.
- Session 4: added a Bells of the Coast lore box to fill the travel closer.

No em dashes.

Co-Authored-By: Claude Opus 4.8 <noreply@anthropic.com>
</commit_message>
<xml_diff>
--- a/sessions/session_05_curse_of_davy_jones.docx
+++ b/sessions/session_05_curse_of_davy_jones.docx
@@ -3226,7 +3226,7 @@
       <w:r>
         <w:drawing>
           <wp:inline xmlns:a="http://schemas.openxmlformats.org/drawingml/2006/main" xmlns:pic="http://schemas.openxmlformats.org/drawingml/2006/picture">
-            <wp:extent cx="5303520" cy="3532227"/>
+            <wp:extent cx="5943600" cy="3958530"/>
             <wp:docPr id="8" name="Picture 8"/>
             <wp:cNvGraphicFramePr>
               <a:graphicFrameLocks noChangeAspect="1"/>
@@ -3247,7 +3247,7 @@
                   <pic:spPr>
                     <a:xfrm>
                       <a:off x="0" y="0"/>
-                      <a:ext cx="5303520" cy="3532227"/>
+                      <a:ext cx="5943600" cy="3958530"/>
                     </a:xfrm>
                     <a:prstGeom prst="rect"/>
                   </pic:spPr>

</xml_diff>

<commit_message>
Session 5: the essence is unknown at the pour, the roll reveals it
The pour scene pre-named the essence 'Ghost' in its heading, flavor text,
and caption, contradicting the sealed-roll framing two lines down ('the
dice decide, and nobody peeks'). At the moment Lilly guides it home the
essence is unknown; the 1d12 roll determines it, and the Ghost identity
lands in Session 6 (Wraithpine's ghost-light) as the bestiary already
records. Retitled 'The Waiting Essence', stripped the pale/cold/sea-mist
and 'ghost light' tells from the flavor line, caption now reads 'the
unknown essence', and the two DM-summary mentions follow suit.

Co-Authored-By: Claude Opus 4.8 <noreply@anthropic.com>
</commit_message>
<xml_diff>
--- a/sessions/session_05_curse_of_davy_jones.docx
+++ b/sessions/session_05_curse_of_davy_jones.docx
@@ -4665,7 +4665,7 @@
           <w:color w:val="A0522D"/>
           <w:sz w:val="26"/>
         </w:rPr>
-        <w:t>The Ghost Essence</w:t>
+        <w:t>The Waiting Essence</w:t>
       </w:r>
     </w:p>
     <w:p>
@@ -4685,7 +4685,7 @@
           <w:color w:val="222222"/>
           <w:sz w:val="21"/>
         </w:rPr>
-        <w:t>One light does not fly away. A pale, drifting essence, cold and gentle as sea mist, circles down out of the spiral and hangs before Floraburst, who has ridden out the whole battle tucked in Lilly's pack, and who now reaches up toward it with every leaf and petal she has. Lilly cups her hands around the little ghost light, steady as her mother taught her, and guides it home.</w:t>
+        <w:t>One light does not fly away. A single drifting essence, its colors shifting and impossible to name, circles down out of the spiral and hangs before Floraburst, who has ridden out the whole battle tucked in Lilly's pack, and who now reaches up toward it with every leaf and petal she has. Lilly cups her hands around the little light, steady as her mother taught her, and guides it home.</w:t>
       </w:r>
     </w:p>
     <w:p>
@@ -4741,7 +4741,7 @@
           <w:color w:val="888888"/>
           <w:sz w:val="18"/>
         </w:rPr>
-        <w:t>Lilly guides the pale ghost essence home to Floraburst.</w:t>
+        <w:t>Lilly guides the unknown essence home to Floraburst.</w:t>
       </w:r>
     </w:p>
     <w:p>
@@ -5411,7 +5411,7 @@
           <w:color w:val="222222"/>
           <w:sz w:val="21"/>
         </w:rPr>
-        <w:t>Six parts, two set pieces, three fights, one rest. P1 Havenmoor send-off → two days learning the ship (stations and knots both pay off). P2 THE STORM: three great blows at stations → the capsize ladder; no roll saves the ship. P3 chained aboard the Dutchman: the hold tour, Davy's offer, the refusal. P4 SEVEN-EYES for their souls (the table WON, 77 exactly) → SHORT REST in the guest chambers. P5 FIGHT 1 the weather deck → FIGHT 2 the hold. P6 BOSS: Davy Jones, gone for good → the essences fly free, the pale essence chooses Floraburst (roll stays SEALED), the Vigil, dawn, LEVEL 5.</w:t>
+        <w:t>Six parts, two set pieces, three fights, one rest. P1 Havenmoor send-off → two days learning the ship (stations and knots both pay off). P2 THE STORM: three great blows at stations → the capsize ladder; no roll saves the ship. P3 chained aboard the Dutchman: the hold tour, Davy's offer, the refusal. P4 SEVEN-EYES for their souls (the table WON, 77 exactly) → SHORT REST in the guest chambers. P5 FIGHT 1 the weather deck → FIGHT 2 the hold. P6 BOSS: Davy Jones, gone for good → the essences fly free, the waiting essence chooses Floraburst (roll stays SEALED), the Vigil, dawn, LEVEL 5.</w:t>
       </w:r>
     </w:p>
     <w:p>
@@ -5630,7 +5630,7 @@
           <w:color w:val="222222"/>
           <w:sz w:val="21"/>
         </w:rPr>
-        <w:t xml:space="preserve"> falls in love with the helm, the pumps, every clever piece of the Stormwind → the quiet gift die that saves Ursa's round at the dice table → “You will not touch her. Not one petal.” → her frost dagger carries the hold fight → she cups the pale essence home (Seeds: the change, sealed until she wakes; Guild-stamped crates, her own guild's mark, waiting in Gearhaven).</w:t>
+        <w:t xml:space="preserve"> falls in love with the helm, the pumps, every clever piece of the Stormwind → the quiet gift die that saves Ursa's round at the dice table → “You will not touch her. Not one petal.” → her frost dagger carries the hold fight → she cups the waiting essence home (Seeds: the change, sealed until she wakes; Guild-stamped crates, her own guild's mark, waiting in Gearhaven).</w:t>
       </w:r>
     </w:p>
     <w:p>

</xml_diff>